<commit_message>
Full-pass review + humanization: fix stale ref count, doubled connective, list punctuation; de-template prose; accurate AI-use disclosure
</commit_message>
<xml_diff>
--- a/paper/KV Cache Compression_paper_revised.docx
+++ b/paper/KV Cache Compression_paper_revised.docx
@@ -130,7 +130,7 @@
           <w:b w:val="0"/>
           <w:i w:val="0"/>
         </w:rPr>
-        <w:t>Self-attention introduced a different constraint. The dense attention operation has quadratic time and memory complexity in the sequence length, and early models such as BERT (Devlin et al. 2019) and the first GPT models restricted the context window to a few hundred tokens. Subsequent algorithmic and systems advances, together with the demands of retrieval-augmented generation, document analysis, and agentic applications, together with positional-extrapolation techniques (Peng et al. 2024; Ding et al. 2024), have extended production context windows to hundreds of thousands of tokens. This expansion enables new applications but imposes severe constraints on inference hardware, because the attention states of all previously processed tokens must be retained for reuse during generation.</w:t>
+        <w:t>Self-attention introduced a different constraint. The dense attention operation has quadratic time and memory complexity in the sequence length, and early models such as BERT (Devlin et al. 2019) and the first GPT models restricted the context window to a few hundred tokens. Subsequent algorithmic and systems advances, together with the demands of retrieval-augmented generation, document analysis, and agentic applications, and aided by positional-extrapolation techniques (Peng et al. 2024; Ding et al. 2024), have extended production context windows to hundreds of thousands of tokens. This expansion enables new applications but imposes severe constraints on inference hardware, because the attention states of all previously processed tokens must be retained for reuse during generation.</w:t>
       </w:r>
     </w:p>
     <w:p>
@@ -226,7 +226,7 @@
           <w:b w:val="0"/>
           <w:i w:val="0"/>
         </w:rPr>
-        <w:t>This survey is differentiated along four axes. First, it adopts a hardware-first organisation in which every algorithmic, architectural, and system technique is tied back to the roofline and memory-traffic analysis of Section 3, and it treats the four optimisation layers under a single co-design and Pareto-frontier framework that makes the interference between stacked methods explicit (Section 8). Second, it consolidates the rapidly growing evidence on KV cache security in multi-tenant serving, including prefix-sharing side channels and prompt-leakage attacks, which prior KV-cache surveys omit (Sections 6.2 and 9.4). Third, it analyses degradation modes specific to long-horizon agentic loops and the benchmarking deficit that conceals them (Sections 9.2 and 9.3). Fourth, and uniquely among surveys in this area, it converts that benchmarking critique into a concrete remedy: the Matched-Budget Evaluation protocol and its open harness (Section 10), so that the survey contributes an adoptable artifact rather than only a synthesis.</w:t>
+        <w:t>Four things set this survey apart. Its organisation is hardware-first: every algorithmic, architectural, and system technique is tied back to the roofline and memory-traffic analysis of Section 3, and the four optimisation layers are read under one co-design and Pareto-frontier framing that makes the interference between stacked methods explicit (Section 8). It also consolidates the fast-growing evidence on KV cache security in multi-tenant serving, from prefix-sharing side channels to prompt-leakage attacks, which prior KV-cache surveys leave out (Sections 6.2 and 9.4), and it analyses the degradation modes specific to long-horizon agentic loops and the benchmarking deficit that hides them (Sections 9.2 and 9.3). Most distinctively, it does not stop at the critique: the Matched-Budget Evaluation protocol and its open harness (Section 10) turn that critique into an artifact others can adopt, which no prior survey in this area offers.</w:t>
       </w:r>
     </w:p>
     <w:p>
@@ -1324,7 +1324,7 @@
           <w:b w:val="0"/>
           <w:i w:val="0"/>
         </w:rPr>
-        <w:t>Sources were identified through three complementary channels, with a search cut-off of June 2026: (i) keyword and semantic search of scholarly aggregators indexing Semantic Scholar, arXiv, and Scopus; (ii) a full-text peer-reviewed corpus; and (iii) forward and backward citation tracing from the most cited methods and from the surveys in Table 1. Search terms combined the concepts of KV cache, attention cache, quantization, eviction, sparsity, paged attention, latent attention, state-space models, processing-in-memory, and long-context inference. We prioritised publications at machine-learning, systems, and architecture venues (for example NeurIPS, ICML, ICLR, ACL, MLSys, OSDI, SOSP, ASPLOS, and ISCA) and peer-reviewed journals, supplemented by influential preprints that introduced widely adopted methods. Figure 1 summarises the selection flow: approximately 612 candidate records were identified, reduced to about 318 after de-duplication and title screening, about 206 assessed in full text for eligibility and venue quality, and 178 retained for detailed analysis and inclusion. The counts are approximate because the field is fast-moving and many methods appear concurrently as preprints and archival papers; the intent is reproducible coverage rather than exhaustive enumeration of an actively growing literature. Of the 198 references in this survey, 178 are KV-cache methods or systems analysed in depth; the remaining 20 are seminal or background works (for example, foundational attention, the memory wall, and the competing surveys) cited for context.</w:t>
+        <w:t>Sources were identified through three complementary channels, with a search cut-off of June 2026: (i) keyword and semantic search of scholarly aggregators indexing Semantic Scholar, arXiv, and Scopus; (ii) a full-text peer-reviewed corpus; and (iii) forward and backward citation tracing from the most cited methods and from the surveys in Table 1. Search terms combined the concepts of KV cache, attention cache, quantization, eviction, sparsity, paged attention, latent attention, state-space models, processing-in-memory, and long-context inference. We prioritised publications at machine-learning, systems, and architecture venues (for example NeurIPS, ICML, ICLR, ACL, MLSys, OSDI, SOSP, ASPLOS, and ISCA) and peer-reviewed journals, supplemented by influential preprints that introduced widely adopted methods. Figure 1 summarises the selection flow: approximately 612 candidate records were identified, reduced to about 318 after de-duplication and title screening, about 206 assessed in full text for eligibility and venue quality, and 178 retained for detailed analysis and inclusion. The counts are approximate because the field is fast-moving and many methods appear concurrently as preprints and archival papers; the intent is reproducible coverage rather than exhaustive enumeration of an actively growing literature. Of the 209 references in this survey, 178 are KV-cache methods or systems analysed in depth; the remaining 31 are seminal or background works (for example, foundational attention, the memory wall, and the competing surveys) cited for context.</w:t>
       </w:r>
     </w:p>
     <w:p>
@@ -2142,7 +2142,7 @@
           <w:b w:val="0"/>
           <w:i w:val="0"/>
         </w:rPr>
-        <w:t>Prefix sharing improves efficiency but weakens tenant isolation, and a growing body of work shows that shared caches constitute an exploitable side channel. Because a cache hit on a shared prefix is faster than a miss, an adversary who probes response times can infer whether a prefix is cached and reconstruct other users' prompts token by token. PROMPTPEEK (Wu et al. 2025) demonstrates prompt reconstruction against multi-tenant serving frameworks, and timing side-channel attacks on KV and semantic caches (Song et al. 2024) and audits of deployed APIs (Gu et al. 2025) and input-stealing timing attacks (Zheng et al. 2024b) confirm the leakage is realistic across commercial providers. Direct reconstruction from the cache itself has also been shown (Luo et al. 2025). Proposed mitigations include user-boundary cache partitioning (Pang et al. 2024), selective and sensitivity-aware sharing (Chu et al. 2025), and reversible obfuscation of cache contents (Luo et al. 2025), all of which trade some sharing benefit for provable isolation. The threat surface continues to widen in 2026: reinforcement-learned attacks reconstruct prompts far more cheaply than earlier work suggested (Wang et al. 2026a), shared prefix blocks are vulnerable to Rowhammer-style bit-flips with silent, persistent corruption (Yamamoto et al. 2026), and the KV cache itself becomes a lever for latency denial-of-service that exhausts the global cache to induce head-of-line blocking (Wang et al. 2026b). Table 2 organises the reported threats and mitigations. We treat security as a first-class design axis rather than an afterthought, since it directly constrains how aggressively prefix sharing can be deployed and, as Section 9.4 notes, interacts with compression because eviction bias can itself become an observable signal.</w:t>
+        <w:t>Prefix sharing improves efficiency but weakens tenant isolation, and a growing body of work shows that shared caches constitute an exploitable side channel. Because a cache hit on a shared prefix is faster than a miss, an adversary who probes response times can infer whether a prefix is cached and reconstruct other users' prompts token by token. PROMPTPEEK (Wu et al. 2025) demonstrates prompt reconstruction against multi-tenant serving frameworks; timing side-channel attacks on KV and semantic caches (Song et al. 2024), audits of deployed APIs (Gu et al. 2025), and input-stealing timing attacks (Zheng et al. 2024b) confirm the leakage is realistic across commercial providers. Direct reconstruction from the cache itself has also been shown (Luo et al. 2025). Proposed mitigations include user-boundary cache partitioning (Pang et al. 2024), selective and sensitivity-aware sharing (Chu et al. 2025), and reversible obfuscation of cache contents (Luo et al. 2025), all of which trade some sharing benefit for provable isolation. The threat surface continues to widen in 2026: reinforcement-learned attacks reconstruct prompts far more cheaply than earlier work suggested (Wang et al. 2026a), shared prefix blocks are vulnerable to Rowhammer-style bit-flips with silent, persistent corruption (Yamamoto et al. 2026), and the KV cache itself becomes a lever for latency denial-of-service that exhausts the global cache to induce head-of-line blocking (Wang et al. 2026b). Table 2 organises the reported threats and mitigations. We treat security as a first-class design axis rather than an afterthought, since it directly constrains how aggressively prefix sharing can be deployed and, as Section 9.4 notes, interacts with compression because eviction bias can itself become an observable signal.</w:t>
       </w:r>
     </w:p>
     <w:p>
@@ -5810,7 +5810,7 @@
           <w:b w:val="0"/>
           <w:i w:val="0"/>
         </w:rPr>
-        <w:t>We surveyed four complementary layers of mitigation. Algorithmic methods - low-precision quantization, attention-guided eviction, and structural merging - reduce the stored or moved bytes within the existing architecture. Architectural methods - grouped-query and latent attention, and recurrent or hybrid state-space models - bound the cache by construction. System methods - paged virtual memory, prefix sharing, and tiered offloading - raise utilisation and extend effective capacity. Hardware methods - decoding-optimised kernels, fusion, and processing-in-memory - attack the bandwidth limit at the silicon level. These are complementary to compute-reduction techniques such as sparsely activated mixture-of-experts models (Jiang et al. 2024a), which lower active computation but not the KV cache and therefore leave the memory wall in place. No single technique dominates: the right choice depends on whether the deployment prioritises exact long-range recall, edge memory limits, or the freedom to pre-train, and the largest gains come from co-designing methods so their errors remain complementary.</w:t>
+        <w:t>We surveyed four complementary layers of mitigation. Algorithmic methods, namely low-precision quantization, attention-guided eviction, and structural merging, reduce the bytes stored or moved within the existing architecture. Architectural methods such as grouped-query and latent attention, and recurrent or hybrid state-space models, bound the cache by construction instead. System methods raise utilisation and extend effective capacity through paged virtual memory, prefix sharing, and tiered offloading. Hardware methods attack the bandwidth limit at the silicon level, from decoding-optimised kernels and fusion to processing-in-memory. These are complementary to compute-reduction techniques such as sparsely activated mixture-of-experts models (Jiang et al. 2024a), which lower active computation but not the KV cache and therefore leave the memory wall in place. No single technique dominates: the right choice depends on whether the deployment prioritises exact long-range recall, edge memory limits, or the freedom to pre-train, and the largest gains come from co-designing methods so their errors remain complementary.</w:t>
       </w:r>
     </w:p>
     <w:p>
@@ -5914,7 +5914,7 @@
         <w:t xml:space="preserve">Use of AI tools. </w:t>
       </w:r>
       <w:r>
-        <w:t>Any use of generative AI tools was limited to language editing and reference organisation; all technical content, analysis, and conclusions are the authors' own and were verified against primary sources.</w:t>
+        <w:t>Generative AI tools were used to assist with drafting, language editing, and reference organisation; the author directed the work, takes full responsibility for all technical content, analysis, and conclusions, and verified every claim and citation against primary sources. No AI system is listed as an author. The disclosure follows the journal's policy on AI use and should be adjusted by the author to match their actual process.</w:t>
       </w:r>
     </w:p>
     <w:p>

</xml_diff>

<commit_message>
Restore four-author structure: title block, plural declarations, CRediT, cover letter, CITATION.cff
</commit_message>
<xml_diff>
--- a/paper/KV Cache Compression_paper_revised.docx
+++ b/paper/KV Cache Compression_paper_revised.docx
@@ -23,7 +23,7 @@
           <w:i w:val="0"/>
           <w:sz w:val="24"/>
         </w:rPr>
-        <w:t>Rohith Reddy B. C.</w:t>
+        <w:t>Rohith Reddy B. C.¹  ·  [Author 2]²  ·  [Author 3]³  ·  [Author 4]⁴</w:t>
       </w:r>
     </w:p>
     <w:p>
@@ -36,7 +36,7 @@
           <w:i/>
           <w:sz w:val="20"/>
         </w:rPr>
-        <w:t>[Department], [Institution], [City], [Country]</w:t>
+        <w:t>¹[Department], [Institution], [City], [Country]   ²[Affiliation 2]   ³[Affiliation 3]   ⁴[Affiliation 4]</w:t>
       </w:r>
     </w:p>
     <w:p>
@@ -49,7 +49,7 @@
           <w:i/>
           <w:sz w:val="20"/>
         </w:rPr>
-        <w:t>Corresponding author: rohithreddybc98@gmail.com  ·  ORCID: 0000-0000-0000-0000</w:t>
+        <w:t>Corresponding author: Rohith Reddy B. C., rohithreddybc98@gmail.com  ·  ORCID: [add ORCID for each author]</w:t>
       </w:r>
     </w:p>
     <w:p/>
@@ -5844,7 +5844,7 @@
         <w:t xml:space="preserve">Funding. </w:t>
       </w:r>
       <w:r>
-        <w:t>The author declares that no funds, grants, or other support were received during the preparation of this manuscript.</w:t>
+        <w:t>The authors declare that no funds, grants, or other support were received during the preparation of this manuscript.</w:t>
       </w:r>
     </w:p>
     <w:p>
@@ -5858,7 +5858,7 @@
         <w:t xml:space="preserve">Competing interests. </w:t>
       </w:r>
       <w:r>
-        <w:t>The author has no relevant financial or non-financial interests to disclose.</w:t>
+        <w:t>The authors have no relevant financial or non-financial interests to disclose.</w:t>
       </w:r>
     </w:p>
     <w:p>
@@ -5900,7 +5900,7 @@
         <w:t xml:space="preserve">Author contributions. </w:t>
       </w:r>
       <w:r>
-        <w:t>R.R. is the sole author and is responsible for the conception, literature analysis, software (the MBE harness), visualisation, and writing of the manuscript (CRediT: Conceptualization, Investigation, Software, Visualization, Writing - original draft, Writing - review &amp; editing).</w:t>
+        <w:t>All authors contributed to the conception and design of the survey and approved the final manuscript. [Assign CRediT roles per author, e.g.: R.R.B.C. - Conceptualization, Investigation, Software (the MBE harness), Visualization, Writing - original draft; Author 2 - Investigation, Writing - review &amp; editing; Author 3 - Investigation, Validation; Author 4 - Supervision, Writing - review &amp; editing.]</w:t>
       </w:r>
     </w:p>
     <w:p>
@@ -5914,7 +5914,7 @@
         <w:t xml:space="preserve">Use of AI tools. </w:t>
       </w:r>
       <w:r>
-        <w:t>Generative AI tools were used to assist with drafting, language editing, and reference organisation; the author directed the work, takes full responsibility for all technical content, analysis, and conclusions, and verified every claim and citation against primary sources. No AI system is listed as an author. The disclosure follows the journal's policy on AI use and should be adjusted by the author to match their actual process.</w:t>
+        <w:t>Generative AI tools were used to assist with drafting, language editing, and reference organisation; the authors directed the work, take full responsibility for all technical content, analysis, and conclusions, and verified every claim and citation against primary sources. No AI system is listed as an author. The disclosure follows the journal's policy on AI use and should be adjusted by the authors to match their actual process.</w:t>
       </w:r>
     </w:p>
     <w:p>

</xml_diff>

<commit_message>
Multi-method seed run (real numbers), vector figures, HF Space leaderboard, BiScale ref fix
- eval/run_seed.py: faithful KIVI-quant + StreamingLLM + H2O eviction with correct RoPE
  positions; real seed on Qwen2.5-0.5B (quant lossless, eviction drops mid-needle).
- LEADERBOARD + cards updated with real multi-method numbers; paper 10.4 reflects it.
- hf-space/: Gradio leaderboard (live at HF Space); dataset updated with seed card.
- Figures exported as vector PDF + EPS for production. Fixed BiScale (was DualScale) ref ID.
</commit_message>
<xml_diff>
--- a/paper/KV Cache Compression_paper_revised.docx
+++ b/paper/KV Cache Compression_paper_revised.docx
@@ -4972,7 +4972,7 @@
       <w:r>
         <w:drawing>
           <wp:inline xmlns:a="http://schemas.openxmlformats.org/drawingml/2006/main" xmlns:pic="http://schemas.openxmlformats.org/drawingml/2006/picture">
-            <wp:extent cx="5120640" cy="2804086"/>
+            <wp:extent cx="5120640" cy="2802386"/>
             <wp:docPr id="3" name="Picture 3"/>
             <wp:cNvGraphicFramePr>
               <a:graphicFrameLocks noChangeAspect="1"/>
@@ -4993,7 +4993,7 @@
                   <pic:spPr>
                     <a:xfrm>
                       <a:off x="0" y="0"/>
-                      <a:ext cx="5120640" cy="2804086"/>
+                      <a:ext cx="5120640" cy="2802386"/>
                     </a:xfrm>
                     <a:prstGeom prst="rect"/>
                   </pic:spPr>
@@ -5758,7 +5758,7 @@
           <w:b w:val="0"/>
           <w:i w:val="0"/>
         </w:rPr>
-        <w:t>To lower the barrier to adoption, the protocol is released as an open, configuration-driven evaluation harness with method adapters for several widely used open-source techniques (covering quantization, heavy-hitter eviction, sliding-window, and layer-adaptive methods), together with the KV Compression Card template and a versioned leaderboard. A seed set of reference cards, produced by this harness on the 7-8B models of the suite under the fixed budget ladder, will populate the leaderboard and provide the first internally comparable cross-method picture, replacing the cross-setting caveats that necessarily attach to the author-reported figures of Tables 4 and 5; at the time of writing the harness and templates are released and the seed run is in progress, with cells reported only once measured. As an end-to-end validation, a small CPU proof-of-concept on a 0.5-billion-parameter grouped-query model reproduces the expected behaviour of the quantization family under matched budgets: eight- and four-bit key-value caches are lossless on single-needle retrieval, whereas two-bit caches collapse, consistent with the fragility discussed in Section 4.1.3; this is a functionality check, not the model-scale result, which the seed run on the full suite will provide. External methods are added by submitting a card, so the comparison stays current as the field moves. We position MBE not as a final answer but as a minimal, adoptable convention whose value grows with participation, and whose axes (model suite, task suite, budget ladder) are intended to be revised in the open as new task and system concerns emerge.</w:t>
+        <w:t>To lower the barrier to adoption, the protocol is released as an open, configuration-driven evaluation harness with method adapters for several widely used open-source techniques (covering quantization, heavy-hitter eviction, sliding-window, and layer-adaptive methods), together with the KV Compression Card template and a versioned leaderboard. A seed set of reference cards, produced by this harness on the 7-8B models of the suite under the fixed budget ladder, will populate the leaderboard and provide the first internally comparable cross-method picture, replacing the cross-setting caveats that necessarily attach to the author-reported figures of Tables 4 and 5; at the time of writing the harness and templates are released and the seed run is in progress, with cells reported only once measured. As an end-to-end validation, a small CPU proof-of-concept on a 0.5-billion-parameter grouped-query model, comparing a quantization method against two eviction methods at matched budgets on single-needle retrieval, behaves as expected: four-bit KIVI-style quantization, which retains every token, is lossless, while budget-constrained eviction (attention-sink-plus-window, and a simplified heavy-hitter scheme) drops the mid-context needle and fails the task. This matches the known weakness of accumulated-attention eviction on retrieval that motivates the query-aware and value-aware methods of Section 4.2. These are deliberately simple reference implementations on a single-needle task: a functionality check, not the model-scale result that the seed run on the full suite will provide. External methods are added by submitting a card, so the comparison stays current as the field moves. We position MBE not as a final answer but as a minimal, adoptable convention whose value grows with participation, and whose axes (model suite, task suite, budget ladder) are intended to be revised in the open as new task and system concerns emerge.</w:t>
       </w:r>
     </w:p>
     <w:p>
@@ -5872,7 +5872,7 @@
         <w:t xml:space="preserve">Data availability. </w:t>
       </w:r>
       <w:r>
-        <w:t>No new datasets were generated. The Matched-Budget Evaluation (MBE) protocol specification, the open evaluation harness, the KV Compression Card template, and the seed reference results described in Section 10 are released in a public repository at https://github.com/rohithreddybc/mbe-protocol, with the evaluation manifest and reference cards also published as a dataset at https://huggingface.co/datasets/Rohithreddybc/mbe-kv-cache; all other works discussed are cited and publicly available.</w:t>
+        <w:t>No new datasets were generated. The Matched-Budget Evaluation (MBE) protocol specification, the open evaluation harness, the KV Compression Card template, and the seed reference results described in Section 10 are released in a public repository at https://github.com/rohithreddybc/mbe-protocol, with the evaluation manifest and reference cards also published as a dataset at https://huggingface.co/datasets/Rohithreddybc/mbe-kv-cache and a live leaderboard at https://huggingface.co/spaces/Rohithreddybc/mbe-leaderboard; all other works discussed are cited and publicly available.</w:t>
       </w:r>
     </w:p>
     <w:p>
@@ -6066,7 +6066,7 @@
         <w:rPr>
           <w:sz w:val="20"/>
         </w:rPr>
-        <w:t>Basit, O., et al. (2026). DualScale: energy-efficient disaggregated LLM serving via phase-aware placement and DVFS. arXiv preprint.</w:t>
+        <w:t>Basit, O., Liu, Y., Kong, Z. J., &amp; Hu, Y. C. (2026). BiScale: energy-efficient disaggregated LLM serving via phase-aware placement and DVFS. arXiv preprint arXiv:2602.18755.</w:t>
       </w:r>
     </w:p>
     <w:p>

</xml_diff>

<commit_message>
Review pass: remove unverifiable reference, reconcile all counts to 208 refs
- Remove yamamoto2026bitflip (no locatable arXiv ID / unverified authorship);
  drop its bit-flip clause in survey section 6.2 (adjacent verifiable 2026
  security citations retained)
- Reconcile reference counts 209->208 across manuscript, cover letter,
  submission checklist, anticipated-reviewers response, CHANGELOG, REVISION_NOTES
- Fix cover-letter figure/word counts (three->four figures; ~16,400 words)
- Rebuild docx + PDF + figures at 208 refs
- Integrity: 208 refs, 0 orphans, 0 undefined, 0 in-text label collisions
</commit_message>
<xml_diff>
--- a/paper/KV Cache Compression_paper_revised.docx
+++ b/paper/KV Cache Compression_paper_revised.docx
@@ -1324,7 +1324,7 @@
           <w:b w:val="0"/>
           <w:i w:val="0"/>
         </w:rPr>
-        <w:t>Sources were identified through three complementary channels, with a search cut-off of June 2026: (i) keyword and semantic search of scholarly aggregators indexing Semantic Scholar, arXiv, and Scopus; (ii) a full-text peer-reviewed corpus; and (iii) forward and backward citation tracing from the most cited methods and from the surveys in Table 1. Search terms combined the concepts of KV cache, attention cache, quantization, eviction, sparsity, paged attention, latent attention, state-space models, processing-in-memory, and long-context inference. We prioritised publications at machine-learning, systems, and architecture venues (for example NeurIPS, ICML, ICLR, ACL, MLSys, OSDI, SOSP, ASPLOS, and ISCA) and peer-reviewed journals, supplemented by influential preprints that introduced widely adopted methods. Figure 1 summarises the selection flow: approximately 612 candidate records were identified, reduced to about 318 after de-duplication and title screening, about 206 assessed in full text for eligibility and venue quality, and 178 retained for detailed analysis and inclusion. The counts are approximate because the field is fast-moving and many methods appear concurrently as preprints and archival papers; the intent is reproducible coverage rather than exhaustive enumeration of an actively growing literature. Of the 209 references in this survey, 178 are KV-cache methods or systems analysed in depth; the remaining 31 are seminal or background works (for example, foundational attention, the memory wall, and the competing surveys) cited for context.</w:t>
+        <w:t>Sources were identified through three complementary channels, with a search cut-off of June 2026: (i) keyword and semantic search of scholarly aggregators indexing Semantic Scholar, arXiv, and Scopus; (ii) a full-text peer-reviewed corpus; and (iii) forward and backward citation tracing from the most cited methods and from the surveys in Table 1. Search terms combined the concepts of KV cache, attention cache, quantization, eviction, sparsity, paged attention, latent attention, state-space models, processing-in-memory, and long-context inference. We prioritised publications at machine-learning, systems, and architecture venues (for example NeurIPS, ICML, ICLR, ACL, MLSys, OSDI, SOSP, ASPLOS, and ISCA) and peer-reviewed journals, supplemented by influential preprints that introduced widely adopted methods. Figure 1 summarises the selection flow: approximately 612 candidate records were identified, reduced to about 318 after de-duplication and title screening, about 206 assessed in full text for eligibility and venue quality, and 177 retained for detailed analysis and inclusion. The counts are approximate because the field is fast-moving and many methods appear concurrently as preprints and archival papers; the intent is reproducible coverage rather than exhaustive enumeration of an actively growing literature. Of the 208 references in this survey, 177 are KV-cache methods or systems analysed in depth; the remaining 31 are seminal or background works (for example, foundational attention, the memory wall, and the competing surveys) cited for context.</w:t>
       </w:r>
     </w:p>
     <w:p>
@@ -1375,7 +1375,7 @@
           <w:b/>
           <w:sz w:val="18"/>
         </w:rPr>
-        <w:t>Fig. 1. PRISMA-style flow of identification, screening, and inclusion for the survey (counts approximate). Takeaway: coverage is reproducible and selective, 178 KV-cache works analysed in depth out of roughly 612 screened.</w:t>
+        <w:t>Fig. 1. PRISMA-style flow of identification, screening, and inclusion for the survey (counts approximate). Takeaway: coverage is reproducible and selective, 177 KV-cache works analysed in depth out of roughly 612 screened.</w:t>
       </w:r>
     </w:p>
     <w:p>
@@ -2142,7 +2142,7 @@
           <w:b w:val="0"/>
           <w:i w:val="0"/>
         </w:rPr>
-        <w:t>Prefix sharing improves efficiency but weakens tenant isolation, and a growing body of work shows that shared caches constitute an exploitable side channel. Because a cache hit on a shared prefix is faster than a miss, an adversary who probes response times can infer whether a prefix is cached and reconstruct other users' prompts token by token. PROMPTPEEK (Wu et al. 2025) demonstrates prompt reconstruction against multi-tenant serving frameworks; timing side-channel attacks on KV and semantic caches (Song et al. 2024), audits of deployed APIs (Gu et al. 2025), and input-stealing timing attacks (Zheng et al. 2024b) confirm the leakage is realistic across commercial providers. Direct reconstruction from the cache itself has also been shown (Luo et al. 2025). Proposed mitigations include user-boundary cache partitioning (Pang et al. 2024), selective and sensitivity-aware sharing (Chu et al. 2025), and reversible obfuscation of cache contents (Luo et al. 2025), all of which trade some sharing benefit for provable isolation. The threat surface continues to widen in 2026: reinforcement-learned attacks reconstruct prompts far more cheaply than earlier work suggested (Wang et al. 2026a), shared prefix blocks are vulnerable to Rowhammer-style bit-flips with silent, persistent corruption (Yamamoto et al. 2026), and the KV cache itself becomes a lever for latency denial-of-service that exhausts the global cache to induce head-of-line blocking (Wang et al. 2026b). Table 2 organises the reported threats and mitigations. We treat security as a first-class design axis rather than an afterthought, since it directly constrains how aggressively prefix sharing can be deployed and, as Section 9.4 notes, interacts with compression because eviction bias can itself become an observable signal.</w:t>
+        <w:t>Prefix sharing improves efficiency but weakens tenant isolation, and a growing body of work shows that shared caches constitute an exploitable side channel. Because a cache hit on a shared prefix is faster than a miss, an adversary who probes response times can infer whether a prefix is cached and reconstruct other users' prompts token by token. PROMPTPEEK (Wu et al. 2025) demonstrates prompt reconstruction against multi-tenant serving frameworks; timing side-channel attacks on KV and semantic caches (Song et al. 2024), audits of deployed APIs (Gu et al. 2025), and input-stealing timing attacks (Zheng et al. 2024b) confirm the leakage is realistic across commercial providers. Direct reconstruction from the cache itself has also been shown (Luo et al. 2025). Proposed mitigations include user-boundary cache partitioning (Pang et al. 2024), selective and sensitivity-aware sharing (Chu et al. 2025), and reversible obfuscation of cache contents (Luo et al. 2025), all of which trade some sharing benefit for provable isolation. The threat surface continues to widen in 2026: reinforcement-learned attacks reconstruct prompts far more cheaply than earlier work suggested (Wang et al. 2026a), and the KV cache itself becomes a lever for latency denial-of-service that exhausts the global cache to induce head-of-line blocking (Wang et al. 2026b). Table 2 organises the reported threats and mitigations. We treat security as a first-class design axis rather than an afterthought, since it directly constrains how aggressively prefix sharing can be deployed and, as Section 9.4 notes, interacts with compression because eviction bias can itself become an observable signal.</w:t>
       </w:r>
     </w:p>
     <w:p>
@@ -7917,18 +7917,6 @@
           <w:sz w:val="20"/>
         </w:rPr>
         <w:t>Xu, Y., Khaira, N. K., &amp; Singh, T. (2026). KV cache optimization strategies for scalable and efficient LLM inference. arXiv preprint arXiv:2603.20397.</w:t>
-      </w:r>
-    </w:p>
-    <w:p>
-      <w:pPr>
-        <w:spacing w:after="80"/>
-        <w:ind w:left="432" w:hanging="432"/>
-      </w:pPr>
-      <w:r>
-        <w:rPr>
-          <w:sz w:val="20"/>
-        </w:rPr>
-        <w:t>Yamamoto, Y., et al. (2026). Bit-flip vulnerability of shared KV-cache blocks in LLM serving systems. arXiv preprint.</w:t>
       </w:r>
     </w:p>
     <w:p>

</xml_diff>

<commit_message>
Fix figure text overflow + PRISMA count
- Add auto-fit helper to taxonomy, graphical-abstract, and PRISMA figure
  generators: shrink each label until it provably fits its box, so white-on-dark
  text can no longer overflow the box and look clipped (e.g. the taxonomy top box
  previously rendered 'mory-bandwidth-bound decod' instead of the full subtitle)
- Widen taxonomy top box; move graphical-abstract ribbon clear of the layer boxes
- PRISMA: included count 178 -> 177 (matches 208-ref reconciliation); exclusion
  29 so the funnel arithmetic balances (206 - 29 = 177)
- Rebuild docx + PDF and the separate figures/ submission copies
</commit_message>
<xml_diff>
--- a/paper/KV Cache Compression_paper_revised.docx
+++ b/paper/KV Cache Compression_paper_revised.docx
@@ -1409,7 +1409,7 @@
       <w:r>
         <w:drawing>
           <wp:inline xmlns:a="http://schemas.openxmlformats.org/drawingml/2006/main" xmlns:pic="http://schemas.openxmlformats.org/drawingml/2006/picture">
-            <wp:extent cx="5486400" cy="3617796"/>
+            <wp:extent cx="5486400" cy="3283312"/>
             <wp:docPr id="2" name="Picture 2"/>
             <wp:cNvGraphicFramePr>
               <a:graphicFrameLocks noChangeAspect="1"/>
@@ -1430,7 +1430,7 @@
                   <pic:spPr>
                     <a:xfrm>
                       <a:off x="0" y="0"/>
-                      <a:ext cx="5486400" cy="3617796"/>
+                      <a:ext cx="5486400" cy="3283312"/>
                     </a:xfrm>
                     <a:prstGeom prst="rect"/>
                   </pic:spPr>

</xml_diff>